<commit_message>
tweak(EM): add participant phone number to export
</commit_message>
<xml_diff>
--- a/tine20/EventManager/Export/templates/teilnehmerliste.docx
+++ b/tine20/EventManager/Export/templates/teilnehmerliste.docx
@@ -74,12 +74,13 @@
         <w:tblLook w:val="04a0" w:noVBand="1" w:noHBand="0" w:lastColumn="0" w:firstColumn="1" w:lastRow="0" w:firstRow="1"/>
       </w:tblPr>
       <w:tblGrid>
-        <w:gridCol w:w="1248"/>
-        <w:gridCol w:w="1532"/>
-        <w:gridCol w:w="1926"/>
-        <w:gridCol w:w="1630"/>
-        <w:gridCol w:w="976"/>
-        <w:gridCol w:w="2750"/>
+        <w:gridCol w:w="1078"/>
+        <w:gridCol w:w="1334"/>
+        <w:gridCol w:w="1330"/>
+        <w:gridCol w:w="1671"/>
+        <w:gridCol w:w="1415"/>
+        <w:gridCol w:w="851"/>
+        <w:gridCol w:w="2383"/>
       </w:tblGrid>
       <w:tr>
         <w:trPr>
@@ -87,7 +88,7 @@
         </w:trPr>
         <w:tc>
           <w:tcPr>
-            <w:tcW w:w="1248" w:type="dxa"/>
+            <w:tcW w:w="1078" w:type="dxa"/>
             <w:tcBorders/>
             <w:shd w:color="auto" w:fill="auto" w:val="clear"/>
           </w:tcPr>
@@ -117,7 +118,7 @@
         </w:tc>
         <w:tc>
           <w:tcPr>
-            <w:tcW w:w="1532" w:type="dxa"/>
+            <w:tcW w:w="1334" w:type="dxa"/>
             <w:tcBorders/>
             <w:shd w:color="auto" w:fill="auto" w:val="clear"/>
           </w:tcPr>
@@ -147,7 +148,36 @@
         </w:tc>
         <w:tc>
           <w:tcPr>
-            <w:tcW w:w="1926" w:type="dxa"/>
+            <w:tcW w:w="1330" w:type="dxa"/>
+            <w:tcBorders/>
+            <w:shd w:color="auto" w:fill="auto" w:val="clear"/>
+          </w:tcPr>
+          <w:p>
+            <w:pPr>
+              <w:pStyle w:val="NoSpacing"/>
+              <w:widowControl w:val="false"/>
+              <w:jc w:val="center"/>
+              <w:rPr>
+                <w:b/>
+                <w:bCs/>
+                <w:sz w:val="24"/>
+                <w:szCs w:val="24"/>
+              </w:rPr>
+            </w:pPr>
+            <w:r>
+              <w:rPr>
+                <w:b/>
+                <w:bCs/>
+                <w:sz w:val="24"/>
+                <w:szCs w:val="24"/>
+              </w:rPr>
+              <w:t>Telefonnummer</w:t>
+            </w:r>
+          </w:p>
+        </w:tc>
+        <w:tc>
+          <w:tcPr>
+            <w:tcW w:w="1671" w:type="dxa"/>
             <w:tcBorders/>
             <w:shd w:color="auto" w:fill="auto" w:val="clear"/>
           </w:tcPr>
@@ -176,7 +206,7 @@
         </w:tc>
         <w:tc>
           <w:tcPr>
-            <w:tcW w:w="1630" w:type="dxa"/>
+            <w:tcW w:w="1415" w:type="dxa"/>
             <w:tcBorders/>
             <w:shd w:color="auto" w:fill="auto" w:val="clear"/>
           </w:tcPr>
@@ -206,7 +236,7 @@
         </w:tc>
         <w:tc>
           <w:tcPr>
-            <w:tcW w:w="976" w:type="dxa"/>
+            <w:tcW w:w="851" w:type="dxa"/>
             <w:tcBorders/>
             <w:shd w:color="auto" w:fill="auto" w:val="clear"/>
           </w:tcPr>
@@ -236,7 +266,7 @@
         </w:tc>
         <w:tc>
           <w:tcPr>
-            <w:tcW w:w="2750" w:type="dxa"/>
+            <w:tcW w:w="2383" w:type="dxa"/>
             <w:tcBorders/>
             <w:shd w:color="auto" w:fill="auto" w:val="clear"/>
           </w:tcPr>
@@ -271,7 +301,7 @@
         </w:trPr>
         <w:tc>
           <w:tcPr>
-            <w:tcW w:w="1248" w:type="dxa"/>
+            <w:tcW w:w="1078" w:type="dxa"/>
             <w:tcBorders/>
             <w:shd w:color="auto" w:fill="auto" w:val="clear"/>
           </w:tcPr>
@@ -296,7 +326,7 @@
         </w:tc>
         <w:tc>
           <w:tcPr>
-            <w:tcW w:w="1532" w:type="dxa"/>
+            <w:tcW w:w="1334" w:type="dxa"/>
             <w:tcBorders/>
             <w:shd w:color="auto" w:fill="auto" w:val="clear"/>
           </w:tcPr>
@@ -305,14 +335,22 @@
               <w:pStyle w:val="NoSpacing"/>
               <w:widowControl w:val="false"/>
               <w:rPr>
-                <w:rFonts w:ascii="Arial" w:hAnsi="Arial" w:eastAsia="Arial" w:cs="Arial"/>
+                <w:rFonts w:ascii="Arial" w:hAnsi="Arial" w:eastAsia="Arial" w:cs="Arial" w:asciiTheme="minorHAnsi" w:cstheme="minorBidi" w:eastAsiaTheme="minorHAnsi" w:hAnsiTheme="minorHAnsi"/>
+                <w:color w:val="auto"/>
+                <w:kern w:val="0"/>
                 <w:sz w:val="20"/>
+                <w:szCs w:val="20"/>
+                <w:lang w:val="de-DE" w:eastAsia="en-US" w:bidi="ar-SA"/>
               </w:rPr>
             </w:pPr>
             <w:r>
               <w:rPr>
-                <w:rFonts w:eastAsia="Arial" w:cs="Arial"/>
+                <w:rFonts w:eastAsia="Arial" w:cs="Arial" w:cstheme="minorBidi" w:eastAsiaTheme="minorHAnsi"/>
+                <w:color w:val="auto"/>
+                <w:kern w:val="0"/>
                 <w:sz w:val="20"/>
+                <w:szCs w:val="20"/>
+                <w:lang w:val="de-DE" w:eastAsia="en-US" w:bidi="ar-SA"/>
               </w:rPr>
               <w:t>{{ record.participant.email }}</w:t>
             </w:r>
@@ -320,7 +358,7 @@
         </w:tc>
         <w:tc>
           <w:tcPr>
-            <w:tcW w:w="1926" w:type="dxa"/>
+            <w:tcW w:w="1330" w:type="dxa"/>
             <w:tcBorders/>
             <w:shd w:color="auto" w:fill="auto" w:val="clear"/>
           </w:tcPr>
@@ -329,19 +367,62 @@
               <w:pStyle w:val="NoSpacing"/>
               <w:widowControl w:val="false"/>
               <w:rPr>
-                <w:rFonts w:ascii="Arial" w:hAnsi="Arial" w:eastAsia="Arial" w:cs="Arial"/>
+                <w:rFonts w:ascii="Arial" w:hAnsi="Arial" w:eastAsia="Arial" w:cs="Arial" w:asciiTheme="minorHAnsi" w:cstheme="minorBidi" w:eastAsiaTheme="minorHAnsi" w:hAnsiTheme="minorHAnsi"/>
+                <w:color w:val="auto"/>
+                <w:kern w:val="0"/>
                 <w:sz w:val="20"/>
+                <w:szCs w:val="20"/>
+                <w:lang w:val="de-DE" w:eastAsia="en-US" w:bidi="ar-SA"/>
               </w:rPr>
             </w:pPr>
             <w:r>
-              <w:rPr/>
+              <w:rPr>
+                <w:rFonts w:eastAsia="Arial" w:cs="Arial" w:cstheme="minorBidi" w:eastAsiaTheme="minorHAnsi"/>
+                <w:color w:val="auto"/>
+                <w:kern w:val="0"/>
+                <w:sz w:val="20"/>
+                <w:szCs w:val="20"/>
+                <w:lang w:val="de-DE" w:eastAsia="en-US" w:bidi="ar-SA"/>
+              </w:rPr>
+              <w:t>{% set phones = [] %}{% if record.participant.tel_prefer_normalized %}{% set phones = phones|merge([record.participant.tel_prefer_normalized]) %}{% endif %}{% if record.participant.tel_cell_normalized %}{% set phones = phones|merge([record.participant.tel_cell_normalized]) %}{% endif %}{% if record.participant.tel_work_normalized %}{% set phones = phones|merge([record.participant.tel_work_normalized]) %}{% endif %}{{ phones|join(', ') }}</w:t>
+            </w:r>
+          </w:p>
+        </w:tc>
+        <w:tc>
+          <w:tcPr>
+            <w:tcW w:w="1671" w:type="dxa"/>
+            <w:tcBorders/>
+            <w:shd w:color="auto" w:fill="auto" w:val="clear"/>
+          </w:tcPr>
+          <w:p>
+            <w:pPr>
+              <w:pStyle w:val="NoSpacing"/>
+              <w:widowControl w:val="false"/>
+              <w:rPr>
+                <w:rFonts w:ascii="Arial" w:hAnsi="Arial" w:eastAsia="Arial" w:cs="Arial" w:asciiTheme="minorHAnsi" w:cstheme="minorBidi" w:eastAsiaTheme="minorHAnsi" w:hAnsiTheme="minorHAnsi"/>
+                <w:color w:val="auto"/>
+                <w:kern w:val="0"/>
+                <w:sz w:val="20"/>
+                <w:szCs w:val="20"/>
+                <w:lang w:val="de-DE" w:eastAsia="en-US" w:bidi="ar-SA"/>
+              </w:rPr>
+            </w:pPr>
+            <w:r>
+              <w:rPr>
+                <w:rFonts w:eastAsia="Arial" w:cs="Arial" w:cstheme="minorBidi" w:eastAsiaTheme="minorHAnsi"/>
+                <w:color w:val="auto"/>
+                <w:kern w:val="0"/>
+                <w:sz w:val="20"/>
+                <w:szCs w:val="20"/>
+                <w:lang w:val="de-DE" w:eastAsia="en-US" w:bidi="ar-SA"/>
+              </w:rPr>
               <w:t>{{ record.participant.bday|date('d.m.Y') }}</w:t>
             </w:r>
           </w:p>
         </w:tc>
         <w:tc>
           <w:tcPr>
-            <w:tcW w:w="1630" w:type="dxa"/>
+            <w:tcW w:w="1415" w:type="dxa"/>
             <w:tcBorders/>
             <w:shd w:color="auto" w:fill="auto" w:val="clear"/>
           </w:tcPr>
@@ -351,14 +432,22 @@
               <w:widowControl w:val="false"/>
               <w:jc w:val="right"/>
               <w:rPr>
-                <w:rFonts w:ascii="Arial" w:hAnsi="Arial" w:eastAsia="Arial" w:cs="Arial"/>
+                <w:rFonts w:ascii="Arial" w:hAnsi="Arial" w:eastAsia="Arial" w:cs="Arial" w:asciiTheme="minorHAnsi" w:cstheme="minorBidi" w:eastAsiaTheme="minorHAnsi" w:hAnsiTheme="minorHAnsi"/>
+                <w:color w:val="auto"/>
+                <w:kern w:val="0"/>
                 <w:sz w:val="20"/>
+                <w:szCs w:val="20"/>
+                <w:lang w:val="de-DE" w:eastAsia="en-US" w:bidi="ar-SA"/>
               </w:rPr>
             </w:pPr>
             <w:r>
               <w:rPr>
-                <w:rFonts w:eastAsia="Arial" w:cs="Arial"/>
+                <w:rFonts w:eastAsia="Arial" w:cs="Arial" w:cstheme="minorBidi" w:eastAsiaTheme="minorHAnsi"/>
+                <w:color w:val="auto"/>
+                <w:kern w:val="0"/>
                 <w:sz w:val="20"/>
+                <w:szCs w:val="20"/>
+                <w:lang w:val="de-DE" w:eastAsia="en-US" w:bidi="ar-SA"/>
               </w:rPr>
               <w:t>{{ record.participant.adr_one_street }} {{ record.participant.adr_one_postalcode }}</w:t>
             </w:r>
@@ -369,14 +458,22 @@
               <w:widowControl w:val="false"/>
               <w:jc w:val="right"/>
               <w:rPr>
-                <w:rFonts w:ascii="Arial" w:hAnsi="Arial" w:eastAsia="Arial" w:cs="Arial"/>
+                <w:rFonts w:ascii="Arial" w:hAnsi="Arial" w:eastAsia="Arial" w:cs="Arial" w:asciiTheme="minorHAnsi" w:cstheme="minorBidi" w:eastAsiaTheme="minorHAnsi" w:hAnsiTheme="minorHAnsi"/>
+                <w:color w:val="auto"/>
+                <w:kern w:val="0"/>
                 <w:sz w:val="20"/>
+                <w:szCs w:val="20"/>
+                <w:lang w:val="de-DE" w:eastAsia="en-US" w:bidi="ar-SA"/>
               </w:rPr>
             </w:pPr>
             <w:r>
               <w:rPr>
-                <w:rFonts w:eastAsia="Arial" w:cs="Arial"/>
+                <w:rFonts w:eastAsia="Arial" w:cs="Arial" w:cstheme="minorBidi" w:eastAsiaTheme="minorHAnsi"/>
+                <w:color w:val="auto"/>
+                <w:kern w:val="0"/>
                 <w:sz w:val="20"/>
+                <w:szCs w:val="20"/>
+                <w:lang w:val="de-DE" w:eastAsia="en-US" w:bidi="ar-SA"/>
               </w:rPr>
               <w:t>{{ record.participant.adr_one_locality }}</w:t>
             </w:r>
@@ -387,14 +484,22 @@
               <w:widowControl w:val="false"/>
               <w:jc w:val="right"/>
               <w:rPr>
-                <w:rFonts w:ascii="Arial" w:hAnsi="Arial" w:eastAsia="Arial" w:cs="Arial"/>
+                <w:rFonts w:ascii="Arial" w:hAnsi="Arial" w:eastAsia="Arial" w:cs="Arial" w:asciiTheme="minorHAnsi" w:cstheme="minorBidi" w:eastAsiaTheme="minorHAnsi" w:hAnsiTheme="minorHAnsi"/>
+                <w:color w:val="auto"/>
+                <w:kern w:val="0"/>
                 <w:sz w:val="20"/>
+                <w:szCs w:val="20"/>
+                <w:lang w:val="de-DE" w:eastAsia="en-US" w:bidi="ar-SA"/>
               </w:rPr>
             </w:pPr>
             <w:r>
               <w:rPr>
-                <w:rFonts w:eastAsia="Arial" w:cs="Arial"/>
+                <w:rFonts w:eastAsia="Arial" w:cs="Arial" w:cstheme="minorBidi" w:eastAsiaTheme="minorHAnsi"/>
+                <w:color w:val="auto"/>
+                <w:kern w:val="0"/>
                 <w:sz w:val="20"/>
+                <w:szCs w:val="20"/>
+                <w:lang w:val="de-DE" w:eastAsia="en-US" w:bidi="ar-SA"/>
               </w:rPr>
               <w:t>{{ record.participant.adr_one_countryname }}</w:t>
             </w:r>
@@ -402,7 +507,7 @@
         </w:tc>
         <w:tc>
           <w:tcPr>
-            <w:tcW w:w="976" w:type="dxa"/>
+            <w:tcW w:w="851" w:type="dxa"/>
             <w:tcBorders/>
             <w:shd w:color="auto" w:fill="auto" w:val="clear"/>
           </w:tcPr>
@@ -413,15 +518,22 @@
               <w:spacing w:lineRule="auto" w:line="240" w:before="0" w:after="0"/>
               <w:jc w:val="right"/>
               <w:rPr>
-                <w:rFonts w:ascii="Arial" w:hAnsi="Arial"/>
+                <w:rFonts w:ascii="Arial" w:hAnsi="Arial" w:eastAsia="Arial" w:cs="Arial" w:asciiTheme="minorHAnsi" w:cstheme="minorBidi" w:eastAsiaTheme="minorHAnsi" w:hAnsiTheme="minorHAnsi"/>
+                <w:color w:val="auto"/>
+                <w:kern w:val="0"/>
+                <w:sz w:val="20"/>
+                <w:szCs w:val="20"/>
+                <w:lang w:val="de-DE" w:eastAsia="en-US" w:bidi="ar-SA"/>
               </w:rPr>
             </w:pPr>
             <w:r>
               <w:rPr>
-                <w:rFonts w:eastAsia="Arial" w:cs="Arial"/>
+                <w:rFonts w:eastAsia="Arial" w:cs="Arial" w:cstheme="minorBidi" w:eastAsiaTheme="minorHAnsi"/>
+                <w:color w:val="auto"/>
+                <w:kern w:val="0"/>
                 <w:sz w:val="20"/>
                 <w:szCs w:val="20"/>
-                <w:lang w:val="en-US"/>
+                <w:lang w:val="de-DE" w:eastAsia="en-US" w:bidi="ar-SA"/>
               </w:rPr>
               <w:t>{{ record.status }}</w:t>
             </w:r>
@@ -429,7 +541,7 @@
         </w:tc>
         <w:tc>
           <w:tcPr>
-            <w:tcW w:w="2750" w:type="dxa"/>
+            <w:tcW w:w="2383" w:type="dxa"/>
             <w:tcBorders/>
             <w:shd w:color="auto" w:fill="auto" w:val="clear"/>
           </w:tcPr>
@@ -440,16 +552,22 @@
               <w:spacing w:lineRule="auto" w:line="240" w:before="0" w:after="0"/>
               <w:jc w:val="right"/>
               <w:rPr>
-                <w:rFonts w:ascii="Arial" w:hAnsi="Arial" w:eastAsia="Arial" w:cs="Arial"/>
+                <w:rFonts w:ascii="Arial" w:hAnsi="Arial" w:eastAsia="Arial" w:cs="Arial" w:asciiTheme="minorHAnsi" w:cstheme="minorBidi" w:eastAsiaTheme="minorHAnsi" w:hAnsiTheme="minorHAnsi"/>
+                <w:color w:val="auto"/>
+                <w:kern w:val="0"/>
                 <w:sz w:val="20"/>
-                <w:lang w:val="en-US"/>
+                <w:szCs w:val="20"/>
+                <w:lang w:val="de-DE" w:eastAsia="en-US" w:bidi="ar-SA"/>
               </w:rPr>
             </w:pPr>
             <w:r>
               <w:rPr>
-                <w:rFonts w:eastAsia="Arial" w:cs="Arial"/>
+                <w:rFonts w:eastAsia="Arial" w:cs="Arial" w:cstheme="minorBidi" w:eastAsiaTheme="minorHAnsi"/>
+                <w:color w:val="auto"/>
+                <w:kern w:val="0"/>
                 <w:sz w:val="20"/>
-                <w:lang w:val="en-US"/>
+                <w:szCs w:val="20"/>
+                <w:lang w:val="de-DE" w:eastAsia="en-US" w:bidi="ar-SA"/>
               </w:rPr>
               <w:t>{% for booked in record.booked_options %}{% if booked.selection_config_class == 'EventManager_Model_Selections_Checkbox' or booked.selection_config_class == 'EventManager_Model_Selections_TextInput' %}{{ booked.option.name_option }}: {% if booked.selection_config_class == 'EventManager_Model_Selections_Checkbox' %}{{ booked.selection_config.booked ? 'Ja' : 'Nein' }}{% else %}{{ booked.selection_config.response }}{% endif %}{{ '\n' }}{% endif %}{% endfor %}</w:t>
             </w:r>
@@ -679,7 +797,7 @@
       <w:rPr>
         <w:color w:themeColor="background1" w:themeShade="80" w:val="808080"/>
       </w:rPr>
-      <w:t>0</w:t>
+      <w:t>2</w:t>
     </w:r>
     <w:r>
       <w:rPr>

</xml_diff>